<commit_message>
Fix cover letter placeholder: XXX X -> XXXX (no space)
</commit_message>
<xml_diff>
--- a/simulation/paper/cover_letter.docx
+++ b/simulation/paper/cover_letter.docx
@@ -36,7 +36,7 @@
           <w:i/>
           <w:sz w:val="24"/>
         </w:rPr>
-        <w:t>XXX X</w:t>
+        <w:t>XXXX</w:t>
       </w:r>
     </w:p>
     <w:p>
@@ -60,7 +60,7 @@
           <w:rFonts w:ascii="Times New Roman" w:hAnsi="Times New Roman" w:eastAsia="Times New Roman"/>
           <w:sz w:val="24"/>
         </w:rPr>
-        <w:t>I am pleased to submit the enclosed manuscript, Personality Interventions Don't Work; Structural Ones Do: Counterfactual Evidence from a HEXACO 7-Typology Workplace Harassment Microsimulation in Japan, for consideration as a Stage 2 Registered Report at XXX X.</w:t>
+        <w:t>I am pleased to submit the enclosed manuscript, Personality Interventions Don't Work; Structural Ones Do: Counterfactual Evidence from a HEXACO 7-Typology Workplace Harassment Microsimulation in Japan, for consideration as a Stage 2 Registered Report at XXXX.</w:t>
       </w:r>
     </w:p>
     <w:p>
@@ -415,7 +415,7 @@
           <w:rFonts w:ascii="Times New Roman" w:hAnsi="Times New Roman" w:eastAsia="Times New Roman"/>
           <w:sz w:val="24"/>
         </w:rPr>
-        <w:t>Per XXX X guidelines, the following experts have publicly stated expertise relevant to this manuscript and have no known conflict of interest with the author:</w:t>
+        <w:t>Per XXXX guidelines, the following experts have publicly stated expertise relevant to this manuscript and have no known conflict of interest with the author:</w:t>
       </w:r>
     </w:p>
     <w:p>

</xml_diff>